<commit_message>
Finalize Selenium tests and test reports
</commit_message>
<xml_diff>
--- a/Selenium_WebDriver/reports/Appointment_Test_Report.docx
+++ b/Selenium_WebDriver/reports/Appointment_Test_Report.docx
@@ -28,7 +28,7 @@
           <w:color w:val="000000"/>
           <w:sz w:val="26"/>
         </w:rPr>
-        <w:t>Thời gian tạo báo cáo: 06/09/2026 19:42:37</w:t>
+        <w:t>Thời gian tạo báo cáo: 07/09/2026 19:12:19</w:t>
       </w:r>
     </w:p>
     <w:p/>
@@ -410,22 +410,22 @@
                 <w:color w:val="000000"/>
                 <w:sz w:val="26"/>
               </w:rPr>
-              <w:t>06/09/2026 19:09:37</w:t>
-            </w:r>
-          </w:p>
-        </w:tc>
-        <w:tc>
-          <w:tcPr>
-            <w:tcW w:type="dxa" w:w="1440"/>
-          </w:tcPr>
-          <w:p>
-            <w:r>
-              <w:rPr>
-                <w:rFonts w:ascii="Times New Roman" w:hAnsi="Times New Roman" w:eastAsia="Times New Roman"/>
-                <w:color w:val="000000"/>
-                <w:sz w:val="26"/>
-              </w:rPr>
-              <w:t>33.68</w:t>
+              <w:t>07/09/2026 18:52:46</w:t>
+            </w:r>
+          </w:p>
+        </w:tc>
+        <w:tc>
+          <w:tcPr>
+            <w:tcW w:type="dxa" w:w="1440"/>
+          </w:tcPr>
+          <w:p>
+            <w:r>
+              <w:rPr>
+                <w:rFonts w:ascii="Times New Roman" w:hAnsi="Times New Roman" w:eastAsia="Times New Roman"/>
+                <w:color w:val="000000"/>
+                <w:sz w:val="26"/>
+              </w:rPr>
+              <w:t>7.73</w:t>
             </w:r>
           </w:p>
         </w:tc>
@@ -500,22 +500,22 @@
                 <w:color w:val="000000"/>
                 <w:sz w:val="26"/>
               </w:rPr>
-              <w:t>06/09/2026 19:09:56</w:t>
-            </w:r>
-          </w:p>
-        </w:tc>
-        <w:tc>
-          <w:tcPr>
-            <w:tcW w:type="dxa" w:w="1440"/>
-          </w:tcPr>
-          <w:p>
-            <w:r>
-              <w:rPr>
-                <w:rFonts w:ascii="Times New Roman" w:hAnsi="Times New Roman" w:eastAsia="Times New Roman"/>
-                <w:color w:val="000000"/>
-                <w:sz w:val="26"/>
-              </w:rPr>
-              <w:t>15.60</w:t>
+              <w:t>07/09/2026 18:52:58</w:t>
+            </w:r>
+          </w:p>
+        </w:tc>
+        <w:tc>
+          <w:tcPr>
+            <w:tcW w:type="dxa" w:w="1440"/>
+          </w:tcPr>
+          <w:p>
+            <w:r>
+              <w:rPr>
+                <w:rFonts w:ascii="Times New Roman" w:hAnsi="Times New Roman" w:eastAsia="Times New Roman"/>
+                <w:color w:val="000000"/>
+                <w:sz w:val="26"/>
+              </w:rPr>
+              <w:t>8.48</w:t>
             </w:r>
           </w:p>
         </w:tc>
@@ -590,22 +590,22 @@
                 <w:color w:val="000000"/>
                 <w:sz w:val="26"/>
               </w:rPr>
-              <w:t>06/09/2026 19:10:15</w:t>
-            </w:r>
-          </w:p>
-        </w:tc>
-        <w:tc>
-          <w:tcPr>
-            <w:tcW w:type="dxa" w:w="1440"/>
-          </w:tcPr>
-          <w:p>
-            <w:r>
-              <w:rPr>
-                <w:rFonts w:ascii="Times New Roman" w:hAnsi="Times New Roman" w:eastAsia="Times New Roman"/>
-                <w:color w:val="000000"/>
-                <w:sz w:val="26"/>
-              </w:rPr>
-              <w:t>15.55</w:t>
+              <w:t>07/09/2026 18:53:10</w:t>
+            </w:r>
+          </w:p>
+        </w:tc>
+        <w:tc>
+          <w:tcPr>
+            <w:tcW w:type="dxa" w:w="1440"/>
+          </w:tcPr>
+          <w:p>
+            <w:r>
+              <w:rPr>
+                <w:rFonts w:ascii="Times New Roman" w:hAnsi="Times New Roman" w:eastAsia="Times New Roman"/>
+                <w:color w:val="000000"/>
+                <w:sz w:val="26"/>
+              </w:rPr>
+              <w:t>8.51</w:t>
             </w:r>
           </w:p>
         </w:tc>
@@ -680,57 +680,51 @@
                 <w:color w:val="000000"/>
                 <w:sz w:val="26"/>
               </w:rPr>
-              <w:t>06/09/2026 19:10:49</w:t>
-            </w:r>
-          </w:p>
-        </w:tc>
-        <w:tc>
-          <w:tcPr>
-            <w:tcW w:type="dxa" w:w="1440"/>
-          </w:tcPr>
-          <w:p>
-            <w:r>
-              <w:rPr>
-                <w:rFonts w:ascii="Times New Roman" w:hAnsi="Times New Roman" w:eastAsia="Times New Roman"/>
-                <w:color w:val="000000"/>
-                <w:sz w:val="26"/>
-              </w:rPr>
-              <w:t>14.29</w:t>
-            </w:r>
-          </w:p>
-        </w:tc>
-        <w:tc>
-          <w:tcPr>
-            <w:tcW w:type="dxa" w:w="1440"/>
-          </w:tcPr>
-          <w:p>
-            <w:r>
-              <w:rPr>
-                <w:rFonts w:ascii="Times New Roman" w:hAnsi="Times New Roman" w:eastAsia="Times New Roman"/>
-                <w:color w:val="000000"/>
-                <w:sz w:val="26"/>
-              </w:rPr>
-            </w:r>
-          </w:p>
-        </w:tc>
-        <w:tc>
-          <w:tcPr>
-            <w:tcW w:type="dxa" w:w="1440"/>
-          </w:tcPr>
-          <w:p>
-            <w:r>
-              <w:rPr>
-                <w:rFonts w:ascii="Times New Roman" w:hAnsi="Times New Roman" w:eastAsia="Times New Roman"/>
-                <w:color w:val="000000"/>
-                <w:sz w:val="26"/>
-              </w:rPr>
-              <w:t>Known bug: bác sĩ chưa thể xem hồ sơ bệnh nhân khi lịch đang chờ xác nhận. | TC-APPOINTMENT-004 | STEP 3 FAILED | Bác sĩ không có nút Xem hồ sơ khi lịch đang Chờ xác nhận</w:t>
-              <w:br/>
-              <w:t>assert False</w:t>
-              <w:br/>
-              <w:t xml:space="preserve"> +  where False = is_patient_profile_button_present(320)</w:t>
-              <w:br/>
-              <w:t xml:space="preserve"> +    where is_patient_profile_button_present = &lt;pages.DoctorAppointmentPage.DoctorAppointmentPage object at 0x0000015EF446FA90&gt;.is_patient_profile_button_present</w:t>
+              <w:t>07/09/2026 18:53:30</w:t>
+            </w:r>
+          </w:p>
+        </w:tc>
+        <w:tc>
+          <w:tcPr>
+            <w:tcW w:type="dxa" w:w="1440"/>
+          </w:tcPr>
+          <w:p>
+            <w:r>
+              <w:rPr>
+                <w:rFonts w:ascii="Times New Roman" w:hAnsi="Times New Roman" w:eastAsia="Times New Roman"/>
+                <w:color w:val="000000"/>
+                <w:sz w:val="26"/>
+              </w:rPr>
+              <w:t>7.92</w:t>
+            </w:r>
+          </w:p>
+        </w:tc>
+        <w:tc>
+          <w:tcPr>
+            <w:tcW w:type="dxa" w:w="1440"/>
+          </w:tcPr>
+          <w:p>
+            <w:r>
+              <w:rPr>
+                <w:rFonts w:ascii="Times New Roman" w:hAnsi="Times New Roman" w:eastAsia="Times New Roman"/>
+                <w:color w:val="000000"/>
+                <w:sz w:val="26"/>
+              </w:rPr>
+            </w:r>
+          </w:p>
+        </w:tc>
+        <w:tc>
+          <w:tcPr>
+            <w:tcW w:type="dxa" w:w="1440"/>
+          </w:tcPr>
+          <w:p>
+            <w:r>
+              <w:rPr>
+                <w:rFonts w:ascii="Times New Roman" w:hAnsi="Times New Roman" w:eastAsia="Times New Roman"/>
+                <w:color w:val="000000"/>
+                <w:sz w:val="26"/>
+              </w:rPr>
+              <w:t>Known bug: bác sĩ chưa thể xem hồ sơ bệnh nhân khi lịch đang chờ xác nhận.</w:t>
             </w:r>
           </w:p>
         </w:tc>
@@ -777,22 +771,22 @@
                 <w:color w:val="000000"/>
                 <w:sz w:val="26"/>
               </w:rPr>
-              <w:t>06/09/2026 19:11:07</w:t>
-            </w:r>
-          </w:p>
-        </w:tc>
-        <w:tc>
-          <w:tcPr>
-            <w:tcW w:type="dxa" w:w="1440"/>
-          </w:tcPr>
-          <w:p>
-            <w:r>
-              <w:rPr>
-                <w:rFonts w:ascii="Times New Roman" w:hAnsi="Times New Roman" w:eastAsia="Times New Roman"/>
-                <w:color w:val="000000"/>
-                <w:sz w:val="26"/>
-              </w:rPr>
-              <w:t>14.58</w:t>
+              <w:t>07/09/2026 18:53:42</w:t>
+            </w:r>
+          </w:p>
+        </w:tc>
+        <w:tc>
+          <w:tcPr>
+            <w:tcW w:type="dxa" w:w="1440"/>
+          </w:tcPr>
+          <w:p>
+            <w:r>
+              <w:rPr>
+                <w:rFonts w:ascii="Times New Roman" w:hAnsi="Times New Roman" w:eastAsia="Times New Roman"/>
+                <w:color w:val="000000"/>
+                <w:sz w:val="26"/>
+              </w:rPr>
+              <w:t>8.18</w:t>
             </w:r>
           </w:p>
         </w:tc>
@@ -867,22 +861,22 @@
                 <w:color w:val="000000"/>
                 <w:sz w:val="26"/>
               </w:rPr>
-              <w:t>06/09/2026 19:11:19</w:t>
-            </w:r>
-          </w:p>
-        </w:tc>
-        <w:tc>
-          <w:tcPr>
-            <w:tcW w:type="dxa" w:w="1440"/>
-          </w:tcPr>
-          <w:p>
-            <w:r>
-              <w:rPr>
-                <w:rFonts w:ascii="Times New Roman" w:hAnsi="Times New Roman" w:eastAsia="Times New Roman"/>
-                <w:color w:val="000000"/>
-                <w:sz w:val="26"/>
-              </w:rPr>
-              <w:t>8.82</w:t>
+              <w:t>07/09/2026 18:53:47</w:t>
+            </w:r>
+          </w:p>
+        </w:tc>
+        <w:tc>
+          <w:tcPr>
+            <w:tcW w:type="dxa" w:w="1440"/>
+          </w:tcPr>
+          <w:p>
+            <w:r>
+              <w:rPr>
+                <w:rFonts w:ascii="Times New Roman" w:hAnsi="Times New Roman" w:eastAsia="Times New Roman"/>
+                <w:color w:val="000000"/>
+                <w:sz w:val="26"/>
+              </w:rPr>
+              <w:t>1.90</w:t>
             </w:r>
           </w:p>
         </w:tc>
@@ -957,22 +951,22 @@
                 <w:color w:val="000000"/>
                 <w:sz w:val="26"/>
               </w:rPr>
-              <w:t>06/09/2026 19:11:40</w:t>
-            </w:r>
-          </w:p>
-        </w:tc>
-        <w:tc>
-          <w:tcPr>
-            <w:tcW w:type="dxa" w:w="1440"/>
-          </w:tcPr>
-          <w:p>
-            <w:r>
-              <w:rPr>
-                <w:rFonts w:ascii="Times New Roman" w:hAnsi="Times New Roman" w:eastAsia="Times New Roman"/>
-                <w:color w:val="000000"/>
-                <w:sz w:val="26"/>
-              </w:rPr>
-              <w:t>17.28</w:t>
+              <w:t>07/09/2026 18:54:01</w:t>
+            </w:r>
+          </w:p>
+        </w:tc>
+        <w:tc>
+          <w:tcPr>
+            <w:tcW w:type="dxa" w:w="1440"/>
+          </w:tcPr>
+          <w:p>
+            <w:r>
+              <w:rPr>
+                <w:rFonts w:ascii="Times New Roman" w:hAnsi="Times New Roman" w:eastAsia="Times New Roman"/>
+                <w:color w:val="000000"/>
+                <w:sz w:val="26"/>
+              </w:rPr>
+              <w:t>10.98</w:t>
             </w:r>
           </w:p>
         </w:tc>
@@ -1047,22 +1041,22 @@
                 <w:color w:val="000000"/>
                 <w:sz w:val="26"/>
               </w:rPr>
-              <w:t>06/09/2026 19:12:01</w:t>
-            </w:r>
-          </w:p>
-        </w:tc>
-        <w:tc>
-          <w:tcPr>
-            <w:tcW w:type="dxa" w:w="1440"/>
-          </w:tcPr>
-          <w:p>
-            <w:r>
-              <w:rPr>
-                <w:rFonts w:ascii="Times New Roman" w:hAnsi="Times New Roman" w:eastAsia="Times New Roman"/>
-                <w:color w:val="000000"/>
-                <w:sz w:val="26"/>
-              </w:rPr>
-              <w:t>17.56</w:t>
+              <w:t>07/09/2026 18:54:15</w:t>
+            </w:r>
+          </w:p>
+        </w:tc>
+        <w:tc>
+          <w:tcPr>
+            <w:tcW w:type="dxa" w:w="1440"/>
+          </w:tcPr>
+          <w:p>
+            <w:r>
+              <w:rPr>
+                <w:rFonts w:ascii="Times New Roman" w:hAnsi="Times New Roman" w:eastAsia="Times New Roman"/>
+                <w:color w:val="000000"/>
+                <w:sz w:val="26"/>
+              </w:rPr>
+              <w:t>11.16</w:t>
             </w:r>
           </w:p>
         </w:tc>
@@ -1137,22 +1131,22 @@
                 <w:color w:val="000000"/>
                 <w:sz w:val="26"/>
               </w:rPr>
-              <w:t>06/09/2026 19:10:32</w:t>
-            </w:r>
-          </w:p>
-        </w:tc>
-        <w:tc>
-          <w:tcPr>
-            <w:tcW w:type="dxa" w:w="1440"/>
-          </w:tcPr>
-          <w:p>
-            <w:r>
-              <w:rPr>
-                <w:rFonts w:ascii="Times New Roman" w:hAnsi="Times New Roman" w:eastAsia="Times New Roman"/>
-                <w:color w:val="000000"/>
-                <w:sz w:val="26"/>
-              </w:rPr>
-              <w:t>13.39</w:t>
+              <w:t>07/09/2026 18:53:19</w:t>
+            </w:r>
+          </w:p>
+        </w:tc>
+        <w:tc>
+          <w:tcPr>
+            <w:tcW w:type="dxa" w:w="1440"/>
+          </w:tcPr>
+          <w:p>
+            <w:r>
+              <w:rPr>
+                <w:rFonts w:ascii="Times New Roman" w:hAnsi="Times New Roman" w:eastAsia="Times New Roman"/>
+                <w:color w:val="000000"/>
+                <w:sz w:val="26"/>
+              </w:rPr>
+              <w:t>5.70</w:t>
             </w:r>
           </w:p>
         </w:tc>
@@ -1363,7 +1357,7 @@
                 <w:color w:val="000000"/>
                 <w:sz w:val="26"/>
               </w:rPr>
-              <w:t>06/09/2026 19:09:16</w:t>
+              <w:t>07/09/2026 18:52:43</w:t>
             </w:r>
           </w:p>
         </w:tc>
@@ -1454,22 +1448,22 @@
                 <w:color w:val="000000"/>
                 <w:sz w:val="26"/>
               </w:rPr>
-              <w:t>06/09/2026 19:09:21</w:t>
-            </w:r>
-          </w:p>
-        </w:tc>
-        <w:tc>
-          <w:tcPr>
-            <w:tcW w:type="dxa" w:w="1440"/>
-          </w:tcPr>
-          <w:p>
-            <w:r>
-              <w:rPr>
-                <w:rFonts w:ascii="Times New Roman" w:hAnsi="Times New Roman" w:eastAsia="Times New Roman"/>
-                <w:color w:val="000000"/>
-                <w:sz w:val="26"/>
-              </w:rPr>
-              <w:t>Chọn ngày 13/09/2026, giờ 08:00 và nhập ghi chú</w:t>
+              <w:t>07/09/2026 18:52:44</w:t>
+            </w:r>
+          </w:p>
+        </w:tc>
+        <w:tc>
+          <w:tcPr>
+            <w:tcW w:type="dxa" w:w="1440"/>
+          </w:tcPr>
+          <w:p>
+            <w:r>
+              <w:rPr>
+                <w:rFonts w:ascii="Times New Roman" w:hAnsi="Times New Roman" w:eastAsia="Times New Roman"/>
+                <w:color w:val="000000"/>
+                <w:sz w:val="26"/>
+              </w:rPr>
+              <w:t>Chọn ngày 19/09/2026, giờ 08:00 và nhập ghi chú</w:t>
             </w:r>
           </w:p>
         </w:tc>
@@ -1545,7 +1539,7 @@
                 <w:color w:val="000000"/>
                 <w:sz w:val="26"/>
               </w:rPr>
-              <w:t>06/09/2026 19:09:25</w:t>
+              <w:t>07/09/2026 18:52:44</w:t>
             </w:r>
           </w:p>
         </w:tc>
@@ -1637,7 +1631,7 @@
                 <w:color w:val="000000"/>
                 <w:sz w:val="26"/>
               </w:rPr>
-              <w:t>06/09/2026 19:09:36</w:t>
+              <w:t>07/09/2026 18:52:45</w:t>
             </w:r>
           </w:p>
         </w:tc>
@@ -1728,7 +1722,7 @@
                 <w:color w:val="000000"/>
                 <w:sz w:val="26"/>
               </w:rPr>
-              <w:t>06/09/2026 19:09:37</w:t>
+              <w:t>07/09/2026 18:52:46</w:t>
             </w:r>
           </w:p>
         </w:tc>
@@ -1819,7 +1813,7 @@
                 <w:color w:val="000000"/>
                 <w:sz w:val="26"/>
               </w:rPr>
-              <w:t>06/09/2026 19:09:37</w:t>
+              <w:t>07/09/2026 18:52:46</w:t>
             </w:r>
           </w:p>
         </w:tc>
@@ -1910,7 +1904,7 @@
                 <w:color w:val="000000"/>
                 <w:sz w:val="26"/>
               </w:rPr>
-              <w:t>06/09/2026 19:09:48</w:t>
+              <w:t>07/09/2026 18:52:51</w:t>
             </w:r>
           </w:p>
         </w:tc>
@@ -2001,7 +1995,7 @@
                 <w:color w:val="000000"/>
                 <w:sz w:val="26"/>
               </w:rPr>
-              <w:t>06/09/2026 19:09:49</w:t>
+              <w:t>07/09/2026 18:52:51</w:t>
             </w:r>
           </w:p>
         </w:tc>
@@ -2092,7 +2086,7 @@
                 <w:color w:val="000000"/>
                 <w:sz w:val="26"/>
               </w:rPr>
-              <w:t>06/09/2026 19:09:50</w:t>
+              <w:t>07/09/2026 18:52:52</w:t>
             </w:r>
           </w:p>
         </w:tc>
@@ -2183,7 +2177,7 @@
                 <w:color w:val="000000"/>
                 <w:sz w:val="26"/>
               </w:rPr>
-              <w:t>06/09/2026 19:09:50</w:t>
+              <w:t>07/09/2026 18:52:52</w:t>
             </w:r>
           </w:p>
         </w:tc>
@@ -2275,7 +2269,7 @@
                 <w:color w:val="000000"/>
                 <w:sz w:val="26"/>
               </w:rPr>
-              <w:t>06/09/2026 19:09:56</w:t>
+              <w:t>07/09/2026 18:52:58</w:t>
             </w:r>
           </w:p>
         </w:tc>
@@ -2366,7 +2360,7 @@
                 <w:color w:val="000000"/>
                 <w:sz w:val="26"/>
               </w:rPr>
-              <w:t>06/09/2026 19:10:07</w:t>
+              <w:t>07/09/2026 18:53:03</w:t>
             </w:r>
           </w:p>
         </w:tc>
@@ -2457,7 +2451,7 @@
                 <w:color w:val="000000"/>
                 <w:sz w:val="26"/>
               </w:rPr>
-              <w:t>06/09/2026 19:10:08</w:t>
+              <w:t>07/09/2026 18:53:03</w:t>
             </w:r>
           </w:p>
         </w:tc>
@@ -2548,7 +2542,7 @@
                 <w:color w:val="000000"/>
                 <w:sz w:val="26"/>
               </w:rPr>
-              <w:t>06/09/2026 19:10:08</w:t>
+              <w:t>07/09/2026 18:53:03</w:t>
             </w:r>
           </w:p>
         </w:tc>
@@ -2639,7 +2633,7 @@
                 <w:color w:val="000000"/>
                 <w:sz w:val="26"/>
               </w:rPr>
-              <w:t>06/09/2026 19:10:09</w:t>
+              <w:t>07/09/2026 18:53:04</w:t>
             </w:r>
           </w:p>
         </w:tc>
@@ -2731,7 +2725,7 @@
                 <w:color w:val="000000"/>
                 <w:sz w:val="26"/>
               </w:rPr>
-              <w:t>06/09/2026 19:10:15</w:t>
+              <w:t>07/09/2026 18:53:10</w:t>
             </w:r>
           </w:p>
         </w:tc>
@@ -2822,7 +2816,7 @@
                 <w:color w:val="000000"/>
                 <w:sz w:val="26"/>
               </w:rPr>
-              <w:t>06/09/2026 19:10:27</w:t>
+              <w:t>07/09/2026 18:53:15</w:t>
             </w:r>
           </w:p>
         </w:tc>
@@ -2913,7 +2907,7 @@
                 <w:color w:val="000000"/>
                 <w:sz w:val="26"/>
               </w:rPr>
-              <w:t>06/09/2026 19:10:27</w:t>
+              <w:t>07/09/2026 18:53:15</w:t>
             </w:r>
           </w:p>
         </w:tc>
@@ -3004,7 +2998,7 @@
                 <w:color w:val="000000"/>
                 <w:sz w:val="26"/>
               </w:rPr>
-              <w:t>06/09/2026 19:10:28</w:t>
+              <w:t>07/09/2026 18:53:15</w:t>
             </w:r>
           </w:p>
         </w:tc>
@@ -3095,7 +3089,7 @@
                 <w:color w:val="000000"/>
                 <w:sz w:val="26"/>
               </w:rPr>
-              <w:t>06/09/2026 19:10:28</w:t>
+              <w:t>07/09/2026 18:53:16</w:t>
             </w:r>
           </w:p>
         </w:tc>
@@ -3186,7 +3180,7 @@
                 <w:color w:val="000000"/>
                 <w:sz w:val="26"/>
               </w:rPr>
-              <w:t>06/09/2026 19:10:32</w:t>
+              <w:t>07/09/2026 18:53:19</w:t>
             </w:r>
           </w:p>
         </w:tc>
@@ -3277,7 +3271,7 @@
                 <w:color w:val="000000"/>
                 <w:sz w:val="26"/>
               </w:rPr>
-              <w:t>06/09/2026 19:10:32</w:t>
+              <w:t>07/09/2026 18:53:19</w:t>
             </w:r>
           </w:p>
         </w:tc>
@@ -3368,7 +3362,7 @@
                 <w:color w:val="000000"/>
                 <w:sz w:val="26"/>
               </w:rPr>
-              <w:t>06/09/2026 19:10:43</w:t>
+              <w:t>07/09/2026 18:53:24</w:t>
             </w:r>
           </w:p>
         </w:tc>
@@ -3459,7 +3453,7 @@
                 <w:color w:val="000000"/>
                 <w:sz w:val="26"/>
               </w:rPr>
-              <w:t>06/09/2026 19:10:43</w:t>
+              <w:t>07/09/2026 18:53:24</w:t>
             </w:r>
           </w:p>
         </w:tc>
@@ -3550,7 +3544,7 @@
                 <w:color w:val="000000"/>
                 <w:sz w:val="26"/>
               </w:rPr>
-              <w:t>06/09/2026 19:10:49</w:t>
+              <w:t>07/09/2026 18:53:30</w:t>
             </w:r>
           </w:p>
         </w:tc>
@@ -3586,7 +3580,7 @@
               <w:br/>
               <w:t xml:space="preserve"> +  where False = is_patient_profile_button_present(320)</w:t>
               <w:br/>
-              <w:t xml:space="preserve"> +    where is_patient_profile_button_present = &lt;pages.DoctorAppointmentPage.DoctorAppointmentPage object at 0x0000015EF446FA90&gt;.is_patient_profile_button_present</w:t>
+              <w:t xml:space="preserve"> +    where is_patient_profile_button_present = &lt;pages.DoctorAppointmentPage.DoctorAppointmentPage object at 0x000001439491C890&gt;.is_patient_profile_button_present</w:t>
             </w:r>
           </w:p>
         </w:tc>
@@ -3648,7 +3642,7 @@
                 <w:color w:val="000000"/>
                 <w:sz w:val="26"/>
               </w:rPr>
-              <w:t>06/09/2026 19:11:01</w:t>
+              <w:t>07/09/2026 18:53:35</w:t>
             </w:r>
           </w:p>
         </w:tc>
@@ -3739,7 +3733,7 @@
                 <w:color w:val="000000"/>
                 <w:sz w:val="26"/>
               </w:rPr>
-              <w:t>06/09/2026 19:11:01</w:t>
+              <w:t>07/09/2026 18:53:35</w:t>
             </w:r>
           </w:p>
         </w:tc>
@@ -3830,7 +3824,7 @@
                 <w:color w:val="000000"/>
                 <w:sz w:val="26"/>
               </w:rPr>
-              <w:t>06/09/2026 19:11:01</w:t>
+              <w:t>07/09/2026 18:53:35</w:t>
             </w:r>
           </w:p>
         </w:tc>
@@ -3921,7 +3915,7 @@
                 <w:color w:val="000000"/>
                 <w:sz w:val="26"/>
               </w:rPr>
-              <w:t>06/09/2026 19:11:07</w:t>
+              <w:t>07/09/2026 18:53:41</w:t>
             </w:r>
           </w:p>
         </w:tc>
@@ -4012,7 +4006,7 @@
                 <w:color w:val="000000"/>
                 <w:sz w:val="26"/>
               </w:rPr>
-              <w:t>06/09/2026 19:11:07</w:t>
+              <w:t>07/09/2026 18:53:42</w:t>
             </w:r>
           </w:p>
         </w:tc>
@@ -4103,7 +4097,7 @@
                 <w:color w:val="000000"/>
                 <w:sz w:val="26"/>
               </w:rPr>
-              <w:t>06/09/2026 19:11:18</w:t>
+              <w:t>07/09/2026 18:53:46</w:t>
             </w:r>
           </w:p>
         </w:tc>
@@ -4194,7 +4188,7 @@
                 <w:color w:val="000000"/>
                 <w:sz w:val="26"/>
               </w:rPr>
-              <w:t>06/09/2026 19:11:19</w:t>
+              <w:t>07/09/2026 18:53:47</w:t>
             </w:r>
           </w:p>
         </w:tc>
@@ -4285,7 +4279,7 @@
                 <w:color w:val="000000"/>
                 <w:sz w:val="26"/>
               </w:rPr>
-              <w:t>06/09/2026 19:11:19</w:t>
+              <w:t>07/09/2026 18:53:47</w:t>
             </w:r>
           </w:p>
         </w:tc>
@@ -4376,7 +4370,7 @@
                 <w:color w:val="000000"/>
                 <w:sz w:val="26"/>
               </w:rPr>
-              <w:t>06/09/2026 19:11:19</w:t>
+              <w:t>07/09/2026 18:53:47</w:t>
             </w:r>
           </w:p>
         </w:tc>
@@ -4467,7 +4461,7 @@
                 <w:color w:val="000000"/>
                 <w:sz w:val="26"/>
               </w:rPr>
-              <w:t>06/09/2026 19:11:19</w:t>
+              <w:t>07/09/2026 18:53:47</w:t>
             </w:r>
           </w:p>
         </w:tc>
@@ -4558,7 +4552,7 @@
                 <w:color w:val="000000"/>
                 <w:sz w:val="26"/>
               </w:rPr>
-              <w:t>06/09/2026 19:11:31</w:t>
+              <w:t>07/09/2026 18:53:51</w:t>
             </w:r>
           </w:p>
         </w:tc>
@@ -4649,7 +4643,7 @@
                 <w:color w:val="000000"/>
                 <w:sz w:val="26"/>
               </w:rPr>
-              <w:t>06/09/2026 19:11:34</w:t>
+              <w:t>07/09/2026 18:53:55</w:t>
             </w:r>
           </w:p>
         </w:tc>
@@ -4740,7 +4734,7 @@
                 <w:color w:val="000000"/>
                 <w:sz w:val="26"/>
               </w:rPr>
-              <w:t>06/09/2026 19:11:34</w:t>
+              <w:t>07/09/2026 18:53:55</w:t>
             </w:r>
           </w:p>
         </w:tc>
@@ -4831,7 +4825,7 @@
                 <w:color w:val="000000"/>
                 <w:sz w:val="26"/>
               </w:rPr>
-              <w:t>06/09/2026 19:11:34</w:t>
+              <w:t>07/09/2026 18:53:55</w:t>
             </w:r>
           </w:p>
         </w:tc>
@@ -4922,7 +4916,7 @@
                 <w:color w:val="000000"/>
                 <w:sz w:val="26"/>
               </w:rPr>
-              <w:t>06/09/2026 19:11:40</w:t>
+              <w:t>07/09/2026 18:54:01</w:t>
             </w:r>
           </w:p>
         </w:tc>
@@ -5013,7 +5007,7 @@
                 <w:color w:val="000000"/>
                 <w:sz w:val="26"/>
               </w:rPr>
-              <w:t>06/09/2026 19:11:51</w:t>
+              <w:t>07/09/2026 18:54:06</w:t>
             </w:r>
           </w:p>
         </w:tc>
@@ -5104,7 +5098,7 @@
                 <w:color w:val="000000"/>
                 <w:sz w:val="26"/>
               </w:rPr>
-              <w:t>06/09/2026 19:11:51</w:t>
+              <w:t>07/09/2026 18:54:06</w:t>
             </w:r>
           </w:p>
         </w:tc>
@@ -5195,7 +5189,7 @@
                 <w:color w:val="000000"/>
                 <w:sz w:val="26"/>
               </w:rPr>
-              <w:t>06/09/2026 19:11:54</w:t>
+              <w:t>07/09/2026 18:54:09</w:t>
             </w:r>
           </w:p>
         </w:tc>
@@ -5286,7 +5280,7 @@
                 <w:color w:val="000000"/>
                 <w:sz w:val="26"/>
               </w:rPr>
-              <w:t>06/09/2026 19:11:55</w:t>
+              <w:t>07/09/2026 18:54:09</w:t>
             </w:r>
           </w:p>
         </w:tc>
@@ -5377,7 +5371,7 @@
                 <w:color w:val="000000"/>
                 <w:sz w:val="26"/>
               </w:rPr>
-              <w:t>06/09/2026 19:12:01</w:t>
+              <w:t>07/09/2026 18:54:15</w:t>
             </w:r>
           </w:p>
         </w:tc>

</xml_diff>